<commit_message>
se hicieron correciones adicionales en actas de entrega
</commit_message>
<xml_diff>
--- a/plantillas/acta_entrega_vehiculo.docx
+++ b/plantillas/acta_entrega_vehiculo.docx
@@ -58,25 +58,7 @@
           <w:sz w:val="24"/>
           <w:lang w:val="es-PE"/>
         </w:rPr>
-        <w:t>${</w:t>
-      </w:r>
-      <w:proofErr w:type="spellStart"/>
-      <w:r>
-        <w:rPr>
-          <w:bCs/>
-          <w:sz w:val="24"/>
-          <w:lang w:val="es-PE"/>
-        </w:rPr>
-        <w:t>acta_presentacion_propietario</w:t>
-      </w:r>
-      <w:proofErr w:type="spellEnd"/>
-      <w:r>
-        <w:rPr>
-          <w:bCs/>
-          <w:sz w:val="24"/>
-          <w:lang w:val="es-PE"/>
-        </w:rPr>
-        <w:t>}</w:t>
+        <w:t>${acta_presentacion_propietario}</w:t>
       </w:r>
     </w:p>
     <w:p>
@@ -191,21 +173,7 @@
               <w:rPr>
                 <w:lang w:val="es-PE"/>
               </w:rPr>
-              <w:t>${</w:t>
-            </w:r>
-            <w:proofErr w:type="spellStart"/>
-            <w:r>
-              <w:rPr>
-                <w:lang w:val="es-PE"/>
-              </w:rPr>
-              <w:t>vehiculo_placa_compuesto</w:t>
-            </w:r>
-            <w:proofErr w:type="spellEnd"/>
-            <w:r>
-              <w:rPr>
-                <w:lang w:val="es-PE"/>
-              </w:rPr>
-              <w:t>}</w:t>
+              <w:t>${vehiculo_placa_compuesto}</w:t>
             </w:r>
           </w:p>
         </w:tc>
@@ -293,25 +261,7 @@
                 <w:sz w:val="24"/>
                 <w:lang w:val="es-PE"/>
               </w:rPr>
-              <w:t>${</w:t>
-            </w:r>
-            <w:proofErr w:type="spellStart"/>
-            <w:r>
-              <w:rPr>
-                <w:bCs/>
-                <w:sz w:val="24"/>
-                <w:lang w:val="es-PE"/>
-              </w:rPr>
-              <w:t>propietario_nombre</w:t>
-            </w:r>
-            <w:proofErr w:type="spellEnd"/>
-            <w:r>
-              <w:rPr>
-                <w:bCs/>
-                <w:sz w:val="24"/>
-                <w:lang w:val="es-PE"/>
-              </w:rPr>
-              <w:t>}</w:t>
+              <w:t>${propietario_nombre}</w:t>
             </w:r>
           </w:p>
         </w:tc>
@@ -397,21 +347,7 @@
               <w:rPr>
                 <w:lang w:val="es-PE"/>
               </w:rPr>
-              <w:t>${</w:t>
-            </w:r>
-            <w:proofErr w:type="spellStart"/>
-            <w:r>
-              <w:rPr>
-                <w:lang w:val="es-PE"/>
-              </w:rPr>
-              <w:t>vehiculo_clase_compuesto</w:t>
-            </w:r>
-            <w:proofErr w:type="spellEnd"/>
-            <w:r>
-              <w:rPr>
-                <w:lang w:val="es-PE"/>
-              </w:rPr>
-              <w:t>}</w:t>
+              <w:t>${vehiculo_clase_compuesto}</w:t>
             </w:r>
           </w:p>
         </w:tc>
@@ -499,25 +435,7 @@
                 <w:sz w:val="24"/>
                 <w:lang w:val="es-PE"/>
               </w:rPr>
-              <w:t>${</w:t>
-            </w:r>
-            <w:proofErr w:type="spellStart"/>
-            <w:r>
-              <w:rPr>
-                <w:bCs/>
-                <w:sz w:val="24"/>
-                <w:lang w:val="es-PE"/>
-              </w:rPr>
-              <w:t>vehiculo_marca_compuesto</w:t>
-            </w:r>
-            <w:proofErr w:type="spellEnd"/>
-            <w:r>
-              <w:rPr>
-                <w:bCs/>
-                <w:sz w:val="24"/>
-                <w:lang w:val="es-PE"/>
-              </w:rPr>
-              <w:t>}</w:t>
+              <w:t>${vehiculo_marca_compuesto}</w:t>
             </w:r>
           </w:p>
         </w:tc>
@@ -605,25 +523,7 @@
                 <w:sz w:val="24"/>
                 <w:lang w:val="es-PE"/>
               </w:rPr>
-              <w:t>${</w:t>
-            </w:r>
-            <w:proofErr w:type="spellStart"/>
-            <w:r>
-              <w:rPr>
-                <w:bCs/>
-                <w:sz w:val="24"/>
-                <w:lang w:val="es-PE"/>
-              </w:rPr>
-              <w:t>vehiculo_modelo_compuesto</w:t>
-            </w:r>
-            <w:proofErr w:type="spellEnd"/>
-            <w:r>
-              <w:rPr>
-                <w:bCs/>
-                <w:sz w:val="24"/>
-                <w:lang w:val="es-PE"/>
-              </w:rPr>
-              <w:t>}</w:t>
+              <w:t>${vehiculo_modelo_compuesto}</w:t>
             </w:r>
           </w:p>
         </w:tc>
@@ -709,21 +609,7 @@
               <w:rPr>
                 <w:lang w:val="es-PE"/>
               </w:rPr>
-              <w:t>${</w:t>
-            </w:r>
-            <w:proofErr w:type="spellStart"/>
-            <w:r>
-              <w:rPr>
-                <w:lang w:val="es-PE"/>
-              </w:rPr>
-              <w:t>vehiculo_anio_compuesto</w:t>
-            </w:r>
-            <w:proofErr w:type="spellEnd"/>
-            <w:r>
-              <w:rPr>
-                <w:lang w:val="es-PE"/>
-              </w:rPr>
-              <w:t>}</w:t>
+              <w:t>${vehiculo_anio_compuesto}</w:t>
             </w:r>
           </w:p>
         </w:tc>
@@ -809,21 +695,7 @@
               <w:rPr>
                 <w:lang w:val="es-PE"/>
               </w:rPr>
-              <w:t>${</w:t>
-            </w:r>
-            <w:proofErr w:type="spellStart"/>
-            <w:r>
-              <w:rPr>
-                <w:lang w:val="es-PE"/>
-              </w:rPr>
-              <w:t>vehiculo_color_compuesto</w:t>
-            </w:r>
-            <w:proofErr w:type="spellEnd"/>
-            <w:r>
-              <w:rPr>
-                <w:lang w:val="es-PE"/>
-              </w:rPr>
-              <w:t>}</w:t>
+              <w:t>${vehiculo_color_compuesto}</w:t>
             </w:r>
           </w:p>
         </w:tc>
@@ -893,29 +765,7 @@
           <w:szCs w:val="24"/>
           <w:lang w:val="es-PE"/>
         </w:rPr>
-        <w:t xml:space="preserve">, </w:t>
-      </w:r>
-      <w:proofErr w:type="gramStart"/>
-      <w:r>
-        <w:rPr>
-          <w:bCs/>
-          <w:color w:val="000000" w:themeColor="text1"/>
-          <w:sz w:val="24"/>
-          <w:szCs w:val="24"/>
-          <w:lang w:val="es-PE"/>
-        </w:rPr>
-        <w:t>en razón de</w:t>
-      </w:r>
-      <w:proofErr w:type="gramEnd"/>
-      <w:r>
-        <w:rPr>
-          <w:bCs/>
-          <w:color w:val="000000" w:themeColor="text1"/>
-          <w:sz w:val="24"/>
-          <w:szCs w:val="24"/>
-          <w:lang w:val="es-PE"/>
-        </w:rPr>
-        <w:t xml:space="preserve"> haber presentado documentos que acrediten la propiedad del vehículo antes mencionado y tras haberse realizado el peritaje de constatación de daños y sistemas, siendo</w:t>
+        <w:t>, en razón de haber presentado documentos que acrediten la propiedad del vehículo antes mencionado y tras haberse realizado el peritaje de constatación de daños y sistemas, siendo</w:t>
       </w:r>
       <w:r>
         <w:rPr>
@@ -976,25 +826,7 @@
           <w:sz w:val="24"/>
           <w:lang w:val="es-PE"/>
         </w:rPr>
-        <w:t>${</w:t>
-      </w:r>
-      <w:proofErr w:type="spellStart"/>
-      <w:r>
-        <w:rPr>
-          <w:bCs/>
-          <w:sz w:val="24"/>
-          <w:lang w:val="es-PE"/>
-        </w:rPr>
-        <w:t>hora_culminacion</w:t>
-      </w:r>
-      <w:proofErr w:type="spellEnd"/>
-      <w:r>
-        <w:rPr>
-          <w:bCs/>
-          <w:sz w:val="24"/>
-          <w:lang w:val="es-PE"/>
-        </w:rPr>
-        <w:t>}</w:t>
+        <w:t>${hora_culminacion}</w:t>
       </w:r>
       <w:r>
         <w:rPr>
@@ -1342,15 +1174,7 @@
                                 <w:sz w:val="13"/>
                                 <w:szCs w:val="13"/>
                               </w:rPr>
-                              <w:t>_____________________________</w:t>
-                            </w:r>
-                            <w:r>
-                              <w:rPr>
-                                <w:color w:val="000000"/>
-                                <w:sz w:val="13"/>
-                                <w:szCs w:val="13"/>
-                              </w:rPr>
-                              <w:t>__</w:t>
+                              <w:t>_______________________________</w:t>
                             </w:r>
                             <w:r>
                               <w:rPr>

</xml_diff>